<commit_message>
Agrega diagrama end-to-end y esquemas CDP, CLAUDE.md, y anade material del comite
- CDP-MANUAL-DE-USUARIO.md: diagrama end-to-end de datos y tabla de esquemas
  heredada del manual ADP v2.1 (pendiente de confirmar con el equipo CDP)
- CDP_Manual_de_Usuario.docx: version Word actualizada manualmente
- Elimina CDP_Manual_de_Usuario_nuevo.docx (borrador obsoleto)
- Agrega CLAUDE.md con guia del repositorio para Claude Code
- Agrega material del Comite de Administradores de Datos (Jul)

Co-Authored-By: Claude Fable 5 <noreply@anthropic.com>
</commit_message>
<xml_diff>
--- a/CDP_Manual_de_Usuario.docx
+++ b/CDP_Manual_de_Usuario.docx
@@ -1382,7 +1382,6 @@
           <w:szCs w:val="30"/>
           <w:lang w:val="es-MX" w:eastAsia="es-MX"/>
         </w:rPr>
-        <w:lastRenderedPageBreak/>
         <w:t>1. Introducción</w:t>
       </w:r>
     </w:p>
@@ -2232,7 +2231,6 @@
           <w:color w:val="222222"/>
           <w:lang w:val="es-MX" w:eastAsia="es-MX"/>
         </w:rPr>
-        <w:lastRenderedPageBreak/>
         <w:t xml:space="preserve">El CDP sigue las buenas prácticas de construcción de data </w:t>
       </w:r>
       <w:proofErr w:type="spellStart"/>
@@ -3402,7 +3400,6 @@
           <w:color w:val="222222"/>
           <w:lang w:val="es-MX" w:eastAsia="es-MX"/>
         </w:rPr>
-        <w:lastRenderedPageBreak/>
         <w:t xml:space="preserve">Toda transacción </w:t>
       </w:r>
       <w:r>
@@ -4648,7 +4645,6 @@
           <w:color w:val="222222"/>
           <w:lang w:val="es-MX" w:eastAsia="es-MX"/>
         </w:rPr>
-        <w:lastRenderedPageBreak/>
         <w:t>En una DIM (p. ej. vehículo): trae el estado más actual del registro (los registros históricos reflejan cambios en el tiempo — color, precio, etc.).</w:t>
       </w:r>
     </w:p>
@@ -5031,7 +5027,6 @@
           <w:color w:val="222222"/>
           <w:lang w:val="es-MX" w:eastAsia="es-MX"/>
         </w:rPr>
-        <w:lastRenderedPageBreak/>
         <w:t xml:space="preserve">Luego </w:t>
       </w:r>
       <w:r>
@@ -5296,7 +5291,6 @@
           <w:color w:val="222222"/>
           <w:lang w:val="es-MX" w:eastAsia="es-MX"/>
         </w:rPr>
-        <w:lastRenderedPageBreak/>
         <w:t>Qué producto de datos necesitas. Las opciones son:</w:t>
       </w:r>
     </w:p>
@@ -6334,7 +6328,6 @@
           <w:color w:val="222222"/>
           <w:lang w:val="es-MX" w:eastAsia="es-MX"/>
         </w:rPr>
-        <w:lastRenderedPageBreak/>
         <w:t>Justificación (obligatorio)</w:t>
       </w:r>
     </w:p>
@@ -8415,7 +8408,6 @@
           <w:color w:val="222222"/>
           <w:lang w:val="es-MX" w:eastAsia="es-MX"/>
         </w:rPr>
-        <w:lastRenderedPageBreak/>
         <w:t>Espacio:</w:t>
       </w:r>
       <w:r>
@@ -9424,7 +9416,6 @@
           <w:color w:val="222222"/>
           <w:lang w:val="es-MX" w:eastAsia="es-MX"/>
         </w:rPr>
-        <w:lastRenderedPageBreak/>
         <w:pict w14:anchorId="08EBB858">
           <v:rect id="_x0000_i1031" style="width:0;height:1.5pt" o:hr="t" o:hrstd="t" o:hralign="center" fillcolor="#a0a0a0" stroked="f"/>
         </w:pict>
@@ -9786,8 +9777,8 @@
       <w:r>
         <w:rPr>
           <w:rFonts w:ascii="Calibri" w:hAnsi="Calibri" w:eastAsia="Times New Roman" w:cs="Calibri"/>
-          <w:b/>
-          <w:bCs/>
+          <w:b w:val="1"/>
+          <w:bCs w:val="1"/>
           <w:color w:val="006E44"/>
           <w:sz w:val="30"/>
           <w:szCs w:val="30"/>
@@ -9798,174 +9789,14 @@
       <w:r>
         <w:rPr>
           <w:rFonts w:ascii="Calibri" w:hAnsi="Calibri" w:eastAsia="Times New Roman" w:cs="Calibri"/>
-          <w:b/>
-          <w:bCs/>
+          <w:b w:val="1"/>
+          <w:bCs w:val="1"/>
           <w:color w:val="006E44"/>
           <w:sz w:val="30"/>
           <w:szCs w:val="30"/>
           <w:lang w:val="es-MX" w:eastAsia="es-MX"/>
         </w:rPr>
         <w:t xml:space="preserve">Definiciones. </w:t>
-      </w:r>
-    </w:p>
-    <w:p>
-      <w:pPr>
-        <w:numPr>
-          <w:ilvl w:val="0"/>
-          <w:numId w:val="36"/>
-        </w:numPr>
-        <w:spacing w:before="100" w:beforeAutospacing="1" w:after="60" w:line="240" w:lineRule="auto"/>
-        <w:rPr>
-          <w:rFonts w:ascii="Calibri" w:hAnsi="Calibri" w:eastAsia="Times New Roman" w:cs="Calibri"/>
-          <w:color w:val="222222"/>
-          <w:lang w:val="es-MX" w:eastAsia="es-MX"/>
-        </w:rPr>
-      </w:pPr>
-      <w:r>
-        <w:rPr>
-          <w:rFonts w:ascii="Calibri" w:hAnsi="Calibri" w:eastAsia="Times New Roman" w:cs="Calibri"/>
-          <w:b/>
-          <w:bCs/>
-          <w:color w:val="222222"/>
-          <w:lang w:val="es-MX" w:eastAsia="es-MX"/>
-        </w:rPr>
-        <w:t>Qué es CDP:</w:t>
-      </w:r>
-      <w:r>
-        <w:rPr>
-          <w:rFonts w:ascii="Calibri" w:hAnsi="Calibri" w:eastAsia="Times New Roman" w:cs="Calibri"/>
-          <w:color w:val="222222"/>
-          <w:lang w:val="es-MX" w:eastAsia="es-MX"/>
-        </w:rPr>
-        <w:t xml:space="preserve"> el antiguo </w:t>
-      </w:r>
-      <w:r>
-        <w:rPr>
-          <w:rFonts w:ascii="Calibri" w:hAnsi="Calibri" w:eastAsia="Times New Roman" w:cs="Calibri"/>
-          <w:b/>
-          <w:bCs/>
-          <w:color w:val="222222"/>
-          <w:lang w:val="es-MX" w:eastAsia="es-MX"/>
-        </w:rPr>
-        <w:t xml:space="preserve">ADP (Andes Data </w:t>
-      </w:r>
-      <w:proofErr w:type="spellStart"/>
-      <w:r>
-        <w:rPr>
-          <w:rFonts w:ascii="Calibri" w:hAnsi="Calibri" w:eastAsia="Times New Roman" w:cs="Calibri"/>
-          <w:b/>
-          <w:bCs/>
-          <w:color w:val="222222"/>
-          <w:lang w:val="es-MX" w:eastAsia="es-MX"/>
-        </w:rPr>
-        <w:t>Program</w:t>
-      </w:r>
-      <w:proofErr w:type="spellEnd"/>
-      <w:r>
-        <w:rPr>
-          <w:rFonts w:ascii="Calibri" w:hAnsi="Calibri" w:eastAsia="Times New Roman" w:cs="Calibri"/>
-          <w:b/>
-          <w:bCs/>
-          <w:color w:val="222222"/>
-          <w:lang w:val="es-MX" w:eastAsia="es-MX"/>
-        </w:rPr>
-        <w:t>)</w:t>
-      </w:r>
-      <w:r>
-        <w:rPr>
-          <w:rFonts w:ascii="Calibri" w:hAnsi="Calibri" w:eastAsia="Times New Roman" w:cs="Calibri"/>
-          <w:color w:val="222222"/>
-          <w:lang w:val="es-MX" w:eastAsia="es-MX"/>
-        </w:rPr>
-        <w:t xml:space="preserve"> pasó a ser </w:t>
-      </w:r>
-      <w:r>
-        <w:rPr>
-          <w:rFonts w:ascii="Calibri" w:hAnsi="Calibri" w:eastAsia="Times New Roman" w:cs="Calibri"/>
-          <w:b/>
-          <w:bCs/>
-          <w:color w:val="222222"/>
-          <w:lang w:val="es-MX" w:eastAsia="es-MX"/>
-        </w:rPr>
-        <w:t xml:space="preserve">CDP (Colombia Data </w:t>
-      </w:r>
-      <w:proofErr w:type="spellStart"/>
-      <w:r>
-        <w:rPr>
-          <w:rFonts w:ascii="Calibri" w:hAnsi="Calibri" w:eastAsia="Times New Roman" w:cs="Calibri"/>
-          <w:b/>
-          <w:bCs/>
-          <w:color w:val="222222"/>
-          <w:lang w:val="es-MX" w:eastAsia="es-MX"/>
-        </w:rPr>
-        <w:t>Program</w:t>
-      </w:r>
-      <w:proofErr w:type="spellEnd"/>
-      <w:r>
-        <w:rPr>
-          <w:rFonts w:ascii="Calibri" w:hAnsi="Calibri" w:eastAsia="Times New Roman" w:cs="Calibri"/>
-          <w:b/>
-          <w:bCs/>
-          <w:color w:val="222222"/>
-          <w:lang w:val="es-MX" w:eastAsia="es-MX"/>
-        </w:rPr>
-        <w:t>)</w:t>
-      </w:r>
-      <w:r>
-        <w:rPr>
-          <w:rFonts w:ascii="Calibri" w:hAnsi="Calibri" w:eastAsia="Times New Roman" w:cs="Calibri"/>
-          <w:color w:val="222222"/>
-          <w:lang w:val="es-MX" w:eastAsia="es-MX"/>
-        </w:rPr>
-        <w:t xml:space="preserve"> tras la separación de países; solo contiene datos de Colombia. Es una base de datos </w:t>
-      </w:r>
-      <w:proofErr w:type="spellStart"/>
-      <w:r>
-        <w:rPr>
-          <w:rFonts w:ascii="Calibri" w:hAnsi="Calibri" w:eastAsia="Times New Roman" w:cs="Calibri"/>
-          <w:b/>
-          <w:bCs/>
-          <w:color w:val="222222"/>
-          <w:lang w:val="es-MX" w:eastAsia="es-MX"/>
-        </w:rPr>
-        <w:t>Redshift</w:t>
-      </w:r>
-      <w:proofErr w:type="spellEnd"/>
-      <w:r>
-        <w:rPr>
-          <w:rFonts w:ascii="Calibri" w:hAnsi="Calibri" w:eastAsia="Times New Roman" w:cs="Calibri"/>
-          <w:b/>
-          <w:bCs/>
-          <w:color w:val="222222"/>
-          <w:lang w:val="es-MX" w:eastAsia="es-MX"/>
-        </w:rPr>
-        <w:t xml:space="preserve"> en AWS</w:t>
-      </w:r>
-      <w:r>
-        <w:rPr>
-          <w:rFonts w:ascii="Calibri" w:hAnsi="Calibri" w:eastAsia="Times New Roman" w:cs="Calibri"/>
-          <w:color w:val="222222"/>
-          <w:lang w:val="es-MX" w:eastAsia="es-MX"/>
-        </w:rPr>
-        <w:t xml:space="preserve"> con propósito </w:t>
-      </w:r>
-      <w:r>
-        <w:rPr>
-          <w:rFonts w:ascii="Calibri" w:hAnsi="Calibri" w:eastAsia="Times New Roman" w:cs="Calibri"/>
-          <w:b/>
-          <w:bCs/>
-          <w:color w:val="222222"/>
-          <w:lang w:val="es-MX" w:eastAsia="es-MX"/>
-        </w:rPr>
-        <w:t>analítico</w:t>
-      </w:r>
-      <w:r>
-        <w:rPr>
-          <w:rFonts w:ascii="Calibri" w:hAnsi="Calibri" w:eastAsia="Times New Roman" w:cs="Calibri"/>
-          <w:color w:val="222222"/>
-          <w:lang w:val="es-MX" w:eastAsia="es-MX"/>
-        </w:rPr>
-        <w:t xml:space="preserve"> (no transaccional).</w:t>
       </w:r>
     </w:p>
     <w:p>
@@ -10987,7 +10818,6 @@
           <w:color w:val="222222"/>
           <w:lang w:val="es-MX" w:eastAsia="es-MX"/>
         </w:rPr>
-        <w:lastRenderedPageBreak/>
         <w:t xml:space="preserve">rendimiento en </w:t>
       </w:r>
       <w:proofErr w:type="spellStart"/>
@@ -12606,7 +12436,7 @@
           </w:drawing>
         </mc:Choice>
         <mc:Fallback xmlns:a="http://schemas.openxmlformats.org/drawingml/2006/main" xmlns:a16="http://schemas.microsoft.com/office/drawing/2014/main" xmlns:pic="http://schemas.openxmlformats.org/drawingml/2006/picture" xmlns:a14="http://schemas.microsoft.com/office/drawing/2010/main">
-          <w:pict>
+          <w:pict w14:anchorId="1BA11402">
             <v:rect id="Rectángulo 6" style="position:absolute;margin-left:27.4pt;margin-top:1.1pt;width:513.65pt;height:61.5pt;z-index:-251658229;visibility:visible;mso-wrap-style:square;mso-width-percent:0;mso-height-percent:0;mso-wrap-distance-left:9pt;mso-wrap-distance-top:0;mso-wrap-distance-right:9pt;mso-wrap-distance-bottom:0;mso-position-horizontal:absolute;mso-position-horizontal-relative:text;mso-position-vertical:absolute;mso-position-vertical-relative:text;mso-width-percent:0;mso-height-percent:0;mso-width-relative:margin;mso-height-relative:margin;v-text-anchor:middle" o:spid="_x0000_s1026" fillcolor="#e7e6e6 [3214]" stroked="f" strokeweight="1pt" w14:anchorId="5EB0B2BC" o:gfxdata="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"/>
           </w:pict>
         </mc:Fallback>
@@ -17401,7 +17231,7 @@
 </file>
 
 <file path=word/styles.xml><?xml version="1.0" encoding="utf-8"?>
-<w:styles xmlns:mc="http://schemas.openxmlformats.org/markup-compatibility/2006" xmlns:r="http://schemas.openxmlformats.org/officeDocument/2006/relationships" xmlns:w="http://schemas.openxmlformats.org/wordprocessingml/2006/main" xmlns:w14="http://schemas.microsoft.com/office/word/2010/wordml" xmlns:w15="http://schemas.microsoft.com/office/word/2012/wordml" xmlns:w16cex="http://schemas.microsoft.com/office/word/2018/wordml/cex" xmlns:w16cid="http://schemas.microsoft.com/office/word/2016/wordml/cid" xmlns:w16="http://schemas.microsoft.com/office/word/2018/wordml" xmlns:w16du="http://schemas.microsoft.com/office/word/2023/wordml/word16du" xmlns:w16sdtdh="http://schemas.microsoft.com/office/word/2020/wordml/sdtdatahash" xmlns:w16sdtfl="http://schemas.microsoft.com/office/word/2024/wordml/sdtformatlock" xmlns:w16se="http://schemas.microsoft.com/office/word/2015/wordml/symex" mc:Ignorable="w14 w15 w16se w16cid w16 w16cex w16sdtdh w16sdtfl w16du">
+<w:styles xmlns:wp14="http://schemas.microsoft.com/office/word/2010/wordprocessingDrawing" xmlns:mc="http://schemas.openxmlformats.org/markup-compatibility/2006" xmlns:r="http://schemas.openxmlformats.org/officeDocument/2006/relationships" xmlns:w="http://schemas.openxmlformats.org/wordprocessingml/2006/main" xmlns:w14="http://schemas.microsoft.com/office/word/2010/wordml" xmlns:w15="http://schemas.microsoft.com/office/word/2012/wordml" xmlns:w16cex="http://schemas.microsoft.com/office/word/2018/wordml/cex" xmlns:w16cid="http://schemas.microsoft.com/office/word/2016/wordml/cid" xmlns:w16="http://schemas.microsoft.com/office/word/2018/wordml" xmlns:w16du="http://schemas.microsoft.com/office/word/2023/wordml/word16du" xmlns:w16sdtdh="http://schemas.microsoft.com/office/word/2020/wordml/sdtdatahash" xmlns:w16sdtfl="http://schemas.microsoft.com/office/word/2024/wordml/sdtformatlock" xmlns:w16se="http://schemas.microsoft.com/office/word/2015/wordml/symex" mc:Ignorable="w14 w15 w16se w16cid w16 w16cex w16sdtdh w16sdtfl w16du wp14">
   <w:docDefaults>
     <w:rPrDefault>
       <w:rPr>
@@ -42778,7 +42608,7 @@
         <w:guid w:val="{48265B93-708A-423C-9B06-9784586BADFC}"/>
       </w:docPartPr>
       <w:docPartBody>
-        <w:p>
+        <w:p xmlns:wp14="http://schemas.microsoft.com/office/word/2010/wordml" wp14:textId="77777777">
           <w:pPr>
             <w:pStyle w:val="5114D79113F1497EBEA64F454108FC52"/>
           </w:pPr>
@@ -42807,7 +42637,7 @@
         <w:guid w:val="{B1DE749E-C166-44A4-86C4-45CE88621468}"/>
       </w:docPartPr>
       <w:docPartBody>
-        <w:p>
+        <w:p xmlns:wp14="http://schemas.microsoft.com/office/word/2010/wordml" wp14:textId="77777777">
           <w:pPr>
             <w:pStyle w:val="329124299EBD4915ABCE2F5B6F6F6FEC"/>
           </w:pPr>

</xml_diff>